<commit_message>
Add Nhận xét chung and the Sở's view of the kết quả chốt (#80)
- dossier.general_comment.edit row (Chủ tịch, Thư ký) on Đã chốt điểm, guarded
  by result_published; editGeneralComment use case audits text before/after
- migration 0045: result_published_at, general_comment columns, trigger
  refusing changes once published
- Nhận xét chung in dự thảo biên bản and dự thảo quyết định
- underperformingCriteria domain function, results.underperforming_ratio setting
- scoresVisibility gives province_officer aggregate_only with Tiêu chí dưới mức
- Chủ thể/xã do not receive the Nhận xét chung before Công bố kết quả
- UI: comment form on S43, kết quả block on the Sở dossier page

Co-Authored-By: Claude Opus 5.5 <noreply@anthropic.com>
</commit_message>
<xml_diff>
--- a/packages/infra/templates/du-thao-bien-ban-hop.docx
+++ b/packages/infra/templates/du-thao-bien-ban-hop.docx
@@ -261,6 +261,15 @@
           <w:i w:val="0"/>
         </w:rPr>
         <w:t>................................................................</w:t>
+      </w:r>
+    </w:p>
+    <w:p>
+      <w:r>
+        <w:rPr>
+          <w:b w:val="0"/>
+          <w:i w:val="0"/>
+        </w:rPr>
+        <w:t xml:space="preserve">Nhận xét chung của Hội đồng: {generalComment}</w:t>
       </w:r>
     </w:p>
     <w:p>

</xml_diff>